<commit_message>
fix(guidebooks): correct Clockodo absence workflow in docs
Clockodo is the primary system of record for absences (per
clockodoSync.ts) and syncs read-only into the intranet's Abwesenheiten
page hourly/via webhook — the guides previously said the opposite,
telling readers absences are intranet-only. Now both the Clockodo guide
and the onboarding checklist correctly point to Clockodo's own "Meine
Anträge" flow as the primary way to request absences, with the intranet
page as a read-only mirror (with fallback direct entry).

Co-Authored-By: Claude Sonnet 5 <noreply@anthropic.com>
Claude-Session: https://claude.ai/code/session_014cpdyuz5V8Hx6ViPvGWCtE
</commit_message>
<xml_diff>
--- a/apps/intranet/public/guidebooks/clockodo-zeiterfassung/Clockodo_Zeiterfassung.docx
+++ b/apps/intranet/public/guidebooks/clockodo-zeiterfassung/Clockodo_Zeiterfassung.docx
@@ -69,6 +69,40 @@
         <w:pStyle w:val="Heading1"/>
       </w:pPr>
       <w:r>
+        <w:t>Urlaub &amp; Abwesenheiten beantragen</w:t>
+      </w:r>
+    </w:p>
+    <w:p>
+      <w:r>
+        <w:t>Clockodo ist bei uns auch das führende System für Abwesenheiten — Urlaub, Krankheit und Co. werden direkt dort beantragt, nicht im Intranet.</w:t>
+        <w:br/>
+        <w:t>1. In Clockodo auf „Meine Anträge“ gehen.</w:t>
+        <w:br/>
+        <w:t>2. Über den blauen Button „+ Abwesenheit“ einen neuen Antrag anlegen.</w:t>
+        <w:br/>
+        <w:t>3. Abwesenheitstyp auswählen (z. B. Urlaub, Sonderurlaub, Krankheit, Homeoffice) und den Zeitraum angeben.</w:t>
+        <w:br/>
+        <w:t>4. Optional eine Notiz hinterlegen — privat für die Führungskraft oder öffentlich für alle Kolleg:innen im Abwesenheitsplaner sichtbar.</w:t>
+        <w:br/>
+        <w:t>5. Antrag absenden — er geht zur Genehmigung an die Führungskraft bzw. Team-Verwaltung.</w:t>
+      </w:r>
+    </w:p>
+    <w:p>
+      <w:r>
+        <w:t>Genehmigte und offene Abwesenheiten aus Clockodo erscheinen automatisch — meist innerhalb einer Stunde — schreibgeschützt auf der Seite „Abwesenheiten“ im Intranet. Änderungen müssen weiterhin in Clockodo vorgenommen werden.</w:t>
+      </w:r>
+    </w:p>
+    <w:p>
+      <w:r>
+        <w:t>Alternativ lässt sich auf der Intranet-Seite „Abwesenheiten“ auch direkt ein Antrag stellen (z. B. wenn Clockodo mal nicht erreichbar ist) — der wird dann dort von eurer Führungskraft genehmigt.</w:t>
+      </w:r>
+    </w:p>
+    <w:p/>
+    <w:p>
+      <w:pPr>
+        <w:pStyle w:val="Heading1"/>
+      </w:pPr>
+      <w:r>
         <w:t>Zeiteintrag nachträglich korrigieren</w:t>
       </w:r>
     </w:p>
@@ -81,20 +115,6 @@
         <w:t>2. Den betroffenen Tag bzw. Eintrag anklicken.</w:t>
         <w:br/>
         <w:t>3. Start- und Endzeit korrigieren und speichern.</w:t>
-      </w:r>
-    </w:p>
-    <w:p/>
-    <w:p>
-      <w:pPr>
-        <w:pStyle w:val="Heading1"/>
-      </w:pPr>
-      <w:r>
-        <w:t>Urlaub &amp; Abwesenheiten</w:t>
-      </w:r>
-    </w:p>
-    <w:p>
-      <w:r>
-        <w:t>Wichtig: Urlaub und andere Abwesenheiten werden bei uns NICHT über Clockodo beantragt, sondern über die Seite „Abwesenheiten“ im Intranet. Clockodo dient ausschließlich der täglichen Zeiterfassung.</w:t>
       </w:r>
     </w:p>
     <w:p/>
@@ -147,6 +167,17 @@
     <w:p>
       <w:r>
         <w:t>https://www.clockodo.com/de/funktionen/zeiterfassung-im-browser/</w:t>
+      </w:r>
+    </w:p>
+    <w:p/>
+    <w:p>
+      <w:r>
+        <w:t>Wie trage ich Urlaub in Clockodo ein?</w:t>
+      </w:r>
+    </w:p>
+    <w:p>
+      <w:r>
+        <w:t>https://support.clockodo.com/de/help-center/wie-kann-man-urlaub-eintragen</w:t>
       </w:r>
     </w:p>
     <w:p/>

</xml_diff>